<commit_message>
Add OS info to check reports
</commit_message>
<xml_diff>
--- a/src/templates/check-report/template.docx
+++ b/src/templates/check-report/template.docx
@@ -11,7 +11,7 @@
           <w:noProof/>
         </w:rPr>
         <w:drawing>
-          <wp:inline distT="0" distB="0" distL="0" distR="0" wp14:anchorId="072864FD" wp14:editId="27E737DC">
+          <wp:inline distT="0" distB="0" distL="0" distR="0" wp14:anchorId="072864FD" wp14:editId="0FC778A2">
             <wp:extent cx="1343025" cy="182245"/>
             <wp:effectExtent l="0" t="0" r="0" b="0"/>
             <wp:docPr id="2049" name="shape2049" descr="폰트, 그래픽, 그래픽 디자인, 타이포그래피이(가) 표시된 사진&#10;&#10;AI 생성 콘텐츠는 정확하지 않을 수 있습니다."/>
@@ -933,7 +933,7 @@
             <w:tcBorders>
               <w:top w:val="single" w:sz="4" w:space="0" w:color="ADADAD" w:themeColor="background2" w:themeShade="BF"/>
               <w:left w:val="nil"/>
-              <w:bottom w:val="single" w:sz="4" w:space="0" w:color="747474" w:themeColor="background2" w:themeShade="80"/>
+              <w:bottom w:val="single" w:sz="4" w:space="0" w:color="ADADAD" w:themeColor="background2" w:themeShade="BF"/>
               <w:right w:val="single" w:sz="4" w:space="0" w:color="ADADAD" w:themeColor="background2" w:themeShade="BF"/>
             </w:tcBorders>
             <w:shd w:val="clear" w:color="auto" w:fill="F9F9F9"/>
@@ -952,7 +952,7 @@
               <w:jc w:val="center"/>
               <w:textAlignment w:val="baseline"/>
               <w:rPr>
-                <w:rFonts w:ascii="맑은 고딕" w:eastAsia="맑은 고딕" w:hAnsi="맑은 고딕" w:cs="굴림"/>
+                <w:rFonts w:ascii="맑은 고딕" w:eastAsia="맑은 고딕" w:hAnsi="맑은 고딕" w:cs="굴림" w:hint="eastAsia"/>
                 <w:b/>
                 <w:bCs/>
                 <w:color w:val="000000"/>
@@ -974,105 +974,16 @@
               <w:t>서버 모델</w:t>
             </w:r>
           </w:p>
-          <w:sdt>
-            <w:sdtPr>
-              <w:rPr>
-                <w:b/>
-                <w:bCs/>
-                <w:color w:val="000000" w:themeColor="text1"/>
-                <w:sz w:val="18"/>
-                <w:szCs w:val="18"/>
-              </w:rPr>
-              <w:tag w:val="os_info"/>
-              <w:id w:val="865100606"/>
-            </w:sdtPr>
-            <w:sdtContent>
-              <w:p>
-                <w:pPr>
-                  <w:spacing w:after="0" w:line="240" w:lineRule="auto"/>
-                  <w:jc w:val="center"/>
-                  <w:rPr>
-                    <w:b/>
-                    <w:bCs/>
-                    <w:color w:val="000000" w:themeColor="text1"/>
-                    <w:sz w:val="18"/>
-                    <w:szCs w:val="18"/>
-                  </w:rPr>
-                </w:pPr>
-                <w:r>
-                  <w:rPr>
-                    <w:b/>
-                    <w:bCs/>
-                    <w:color w:val="000000" w:themeColor="text1"/>
-                    <w:sz w:val="18"/>
-                    <w:szCs w:val="18"/>
-                  </w:rPr>
-                  <w:t>{{</w:t>
-                </w:r>
-                <w:proofErr w:type="spellStart"/>
-                <w:r>
-                  <w:rPr>
-                    <w:b/>
-                    <w:bCs/>
-                    <w:color w:val="000000" w:themeColor="text1"/>
-                    <w:sz w:val="18"/>
-                    <w:szCs w:val="18"/>
-                  </w:rPr>
-                  <w:t>os_info</w:t>
-                </w:r>
-                <w:proofErr w:type="spellEnd"/>
-                <w:r>
-                  <w:rPr>
-                    <w:b/>
-                    <w:bCs/>
-                    <w:color w:val="000000" w:themeColor="text1"/>
-                    <w:sz w:val="18"/>
-                    <w:szCs w:val="18"/>
-                  </w:rPr>
-                  <w:t>}}</w:t>
-                </w:r>
-              </w:p>
-            </w:sdtContent>
-          </w:sdt>
-          <w:p>
-            <w:pPr>
-              <w:wordWrap/>
-              <w:spacing w:after="0" w:line="228" w:lineRule="auto"/>
-              <w:jc w:val="center"/>
-              <w:textAlignment w:val="baseline"/>
-              <w:rPr>
-                <w:rFonts w:ascii="맑은 고딕" w:eastAsia="맑은 고딕" w:hAnsi="맑은 고딕" w:cs="굴림"/>
-                <w:b/>
-                <w:bCs/>
-                <w:color w:val="000000" w:themeColor="text1"/>
-                <w:kern w:val="0"/>
-                <w:sz w:val="18"/>
-                <w:szCs w:val="18"/>
-              </w:rPr>
-            </w:pPr>
-            <w:r>
-              <w:rPr>
-                <w:rFonts w:ascii="맑은 고딕" w:eastAsia="맑은 고딕" w:hAnsi="맑은 고딕" w:cs="굴림" w:hint="eastAsia"/>
-                <w:b/>
-                <w:bCs/>
-                <w:color w:val="000000" w:themeColor="text1"/>
-                <w:kern w:val="0"/>
-                <w:sz w:val="18"/>
-                <w:szCs w:val="18"/>
-              </w:rPr>
-              <w:t>서버 모델</w:t>
-            </w:r>
-          </w:p>
-        </w:tc>
-        <w:tc>
-          <w:tcPr>
-            <w:tcW w:w="8720" w:type="dxa"/>
-            <w:gridSpan w:val="6"/>
+        </w:tc>
+        <w:tc>
+          <w:tcPr>
+            <w:tcW w:w="3082" w:type="dxa"/>
+            <w:gridSpan w:val="2"/>
             <w:tcBorders>
               <w:top w:val="single" w:sz="4" w:space="0" w:color="ADADAD" w:themeColor="background2" w:themeShade="BF"/>
               <w:left w:val="single" w:sz="4" w:space="0" w:color="ADADAD" w:themeColor="background2" w:themeShade="BF"/>
-              <w:bottom w:val="single" w:sz="4" w:space="0" w:color="747474" w:themeColor="background2" w:themeShade="80"/>
-              <w:right w:val="nil"/>
+              <w:bottom w:val="single" w:sz="4" w:space="0" w:color="ADADAD" w:themeColor="background2" w:themeShade="BF"/>
+              <w:right w:val="single" w:sz="4" w:space="0" w:color="ADADAD" w:themeColor="background2" w:themeShade="BF"/>
             </w:tcBorders>
             <w:tcMar>
               <w:top w:w="28" w:type="dxa"/>
@@ -1084,14 +995,9 @@
           </w:tcPr>
           <w:p>
             <w:pPr>
-              <w:wordWrap/>
-              <w:spacing w:after="0" w:line="228" w:lineRule="auto"/>
-              <w:jc w:val="center"/>
-              <w:textAlignment w:val="baseline"/>
-              <w:rPr>
-                <w:rFonts w:ascii="맑은 고딕" w:eastAsia="맑은 고딕" w:hAnsi="맑은 고딕" w:cs="굴림"/>
-                <w:color w:val="000000" w:themeColor="text1"/>
-                <w:kern w:val="0"/>
+              <w:spacing w:after="0" w:line="240" w:lineRule="auto"/>
+              <w:jc w:val="center"/>
+              <w:rPr>
                 <w:sz w:val="18"/>
                 <w:szCs w:val="18"/>
               </w:rPr>
@@ -1123,6 +1029,121 @@
                 <w:b/>
                 <w:bCs/>
                 <w:color w:val="000000" w:themeColor="text1"/>
+                <w:sz w:val="18"/>
+                <w:szCs w:val="18"/>
+              </w:rPr>
+              <w:t>}}</w:t>
+            </w:r>
+          </w:p>
+        </w:tc>
+        <w:tc>
+          <w:tcPr>
+            <w:tcW w:w="2286" w:type="dxa"/>
+            <w:gridSpan w:val="3"/>
+            <w:tcBorders>
+              <w:top w:val="single" w:sz="4" w:space="0" w:color="ADADAD" w:themeColor="background2" w:themeShade="BF"/>
+              <w:left w:val="single" w:sz="4" w:space="0" w:color="ADADAD" w:themeColor="background2" w:themeShade="BF"/>
+              <w:bottom w:val="single" w:sz="4" w:space="0" w:color="ADADAD" w:themeColor="background2" w:themeShade="BF"/>
+              <w:right w:val="single" w:sz="4" w:space="0" w:color="ADADAD" w:themeColor="background2" w:themeShade="BF"/>
+            </w:tcBorders>
+            <w:shd w:val="clear" w:color="auto" w:fill="F9F9F9"/>
+            <w:tcMar>
+              <w:top w:w="28" w:type="dxa"/>
+              <w:left w:w="102" w:type="dxa"/>
+              <w:bottom w:w="28" w:type="dxa"/>
+              <w:right w:w="102" w:type="dxa"/>
+            </w:tcMar>
+            <w:vAlign w:val="center"/>
+          </w:tcPr>
+          <w:p>
+            <w:pPr>
+              <w:wordWrap/>
+              <w:spacing w:after="0" w:line="228" w:lineRule="auto"/>
+              <w:jc w:val="center"/>
+              <w:textAlignment w:val="baseline"/>
+              <w:rPr>
+                <w:rFonts w:ascii="맑은 고딕" w:eastAsia="맑은 고딕" w:hAnsi="맑은 고딕" w:cs="굴림" w:hint="eastAsia"/>
+                <w:b/>
+                <w:bCs/>
+                <w:color w:val="000000"/>
+                <w:kern w:val="0"/>
+                <w:sz w:val="18"/>
+                <w:szCs w:val="18"/>
+              </w:rPr>
+            </w:pPr>
+            <w:r>
+              <w:rPr>
+                <w:rFonts w:ascii="맑은 고딕" w:eastAsia="맑은 고딕" w:hAnsi="맑은 고딕" w:cs="굴림" w:hint="eastAsia"/>
+                <w:b/>
+                <w:bCs/>
+                <w:color w:val="000000"/>
+                <w:kern w:val="0"/>
+                <w:sz w:val="18"/>
+                <w:szCs w:val="18"/>
+              </w:rPr>
+              <w:t>OS 정보</w:t>
+            </w:r>
+          </w:p>
+        </w:tc>
+        <w:tc>
+          <w:tcPr>
+            <w:tcW w:w="3352" w:type="dxa"/>
+            <w:tcBorders>
+              <w:top w:val="single" w:sz="4" w:space="0" w:color="ADADAD" w:themeColor="background2" w:themeShade="BF"/>
+              <w:left w:val="single" w:sz="4" w:space="0" w:color="ADADAD" w:themeColor="background2" w:themeShade="BF"/>
+              <w:bottom w:val="single" w:sz="4" w:space="0" w:color="ADADAD" w:themeColor="background2" w:themeShade="BF"/>
+              <w:right w:val="nil"/>
+            </w:tcBorders>
+            <w:tcMar>
+              <w:top w:w="28" w:type="dxa"/>
+              <w:left w:w="102" w:type="dxa"/>
+              <w:bottom w:w="28" w:type="dxa"/>
+              <w:right w:w="102" w:type="dxa"/>
+            </w:tcMar>
+            <w:vAlign w:val="center"/>
+          </w:tcPr>
+          <w:p>
+            <w:pPr>
+              <w:wordWrap/>
+              <w:spacing w:after="0" w:line="228" w:lineRule="auto"/>
+              <w:ind w:right="180"/>
+              <w:jc w:val="center"/>
+              <w:textAlignment w:val="baseline"/>
+              <w:rPr>
+                <w:rFonts w:hint="eastAsia"/>
+                <w:b/>
+                <w:bCs/>
+                <w:sz w:val="18"/>
+                <w:szCs w:val="18"/>
+              </w:rPr>
+            </w:pPr>
+            <w:r>
+              <w:rPr>
+                <w:rFonts w:hint="eastAsia"/>
+                <w:b/>
+                <w:bCs/>
+                <w:sz w:val="18"/>
+                <w:szCs w:val="18"/>
+              </w:rPr>
+              <w:t>{{</w:t>
+            </w:r>
+            <w:proofErr w:type="spellStart"/>
+            <w:r>
+              <w:rPr>
+                <w:rFonts w:hint="eastAsia"/>
+                <w:b/>
+                <w:bCs/>
+                <w:sz w:val="18"/>
+                <w:szCs w:val="18"/>
+              </w:rPr>
+              <w:t>os_info</w:t>
+            </w:r>
+            <w:proofErr w:type="spellEnd"/>
+            <w:r>
+              <w:rPr>
+                <w:rFonts w:hint="eastAsia"/>
+                <w:b/>
+                <w:bCs/>
                 <w:sz w:val="18"/>
                 <w:szCs w:val="18"/>
               </w:rPr>

</xml_diff>